<commit_message>
Polish printer docs and Docker deployment flow
</commit_message>
<xml_diff>
--- a/DOCUMENTS/backend/local-print-agent/install/README.docx
+++ b/DOCUMENTS/backend/local-print-agent/install/README.docx
@@ -34,6 +34,19 @@
         <w:spacing w:after="80"/>
       </w:pPr>
       <w:r>
+        <w:t xml:space="preserve">They are maintainer and packaging assets, not end-user instructions. Production rollout should use a signed installer, MDM, or IT packaging flow so operators never run terminal commands themselves.</w:t>
+      </w:r>
+    </w:p>
+    <w:p>
+      <w:r>
+        <w:t xml:space="preserve"/>
+      </w:r>
+    </w:p>
+    <w:p>
+      <w:pPr>
+        <w:spacing w:after="80"/>
+      </w:pPr>
+      <w:r>
         <w:t xml:space="preserve">Supported rollout paths:</w:t>
       </w:r>
     </w:p>
@@ -91,7 +104,7 @@
         <w:spacing w:after="80"/>
       </w:pPr>
       <w:r>
-        <w:t xml:space="preserve">From the backend folder:</w:t>
+        <w:t xml:space="preserve">For engineering and release packaging from the backend folder:</w:t>
       </w:r>
     </w:p>
     <w:p>
@@ -379,6 +392,160 @@
       </w:pPr>
       <w:r>
         <w:t xml:space="preserve">The agent still depends on the workstation OS already seeing the printer.</w:t>
+      </w:r>
+    </w:p>
+    <w:p>
+      <w:r>
+        <w:t xml:space="preserve"/>
+      </w:r>
+    </w:p>
+    <w:p>
+      <w:pPr>
+        <w:pStyle w:val="Heading2"/>
+        <w:spacing w:before="220" w:after="100"/>
+      </w:pPr>
+      <w:r>
+        <w:t xml:space="preserve">Optional site-gateway configuration</w:t>
+      </w:r>
+    </w:p>
+    <w:p>
+      <w:r>
+        <w:t xml:space="preserve"/>
+      </w:r>
+    </w:p>
+    <w:p>
+      <w:pPr>
+        <w:spacing w:after="80"/>
+      </w:pPr>
+      <w:r>
+        <w:t xml:space="preserve">Each installer creates an optional agent.env file under the agent home:</w:t>
+      </w:r>
+    </w:p>
+    <w:p>
+      <w:r>
+        <w:t xml:space="preserve"/>
+      </w:r>
+    </w:p>
+    <w:p>
+      <w:pPr>
+        <w:pStyle w:val="ListParagraph"/>
+        <w:numPr>
+          <w:ilvl w:val="0"/>
+          <w:numId w:val="1"/>
+        </w:numPr>
+        <w:spacing w:after="60"/>
+      </w:pPr>
+      <w:r>
+        <w:t xml:space="preserve">macOS / Linux: ~/.mscqr/local-print-agent/agent.env</w:t>
+      </w:r>
+    </w:p>
+    <w:p>
+      <w:pPr>
+        <w:pStyle w:val="ListParagraph"/>
+        <w:numPr>
+          <w:ilvl w:val="0"/>
+          <w:numId w:val="1"/>
+        </w:numPr>
+        <w:spacing w:after="60"/>
+      </w:pPr>
+      <w:r>
+        <w:t xml:space="preserve">Windows: %LOCALAPPDATA%\MSCQR\local-print-agent\agent.env</w:t>
+      </w:r>
+    </w:p>
+    <w:p>
+      <w:r>
+        <w:t xml:space="preserve"/>
+      </w:r>
+    </w:p>
+    <w:p>
+      <w:pPr>
+        <w:spacing w:after="80"/>
+      </w:pPr>
+      <w:r>
+        <w:t xml:space="preserve">This file can be provisioned by MDM, installer logic, or IT automation. Supported values include:</w:t>
+      </w:r>
+    </w:p>
+    <w:p>
+      <w:r>
+        <w:t xml:space="preserve"/>
+      </w:r>
+    </w:p>
+    <w:p>
+      <w:pPr>
+        <w:pStyle w:val="ListParagraph"/>
+        <w:numPr>
+          <w:ilvl w:val="0"/>
+          <w:numId w:val="1"/>
+        </w:numPr>
+        <w:spacing w:after="60"/>
+      </w:pPr>
+      <w:r>
+        <w:t xml:space="preserve">PRINT_AGENT_HOST</w:t>
+      </w:r>
+    </w:p>
+    <w:p>
+      <w:pPr>
+        <w:pStyle w:val="ListParagraph"/>
+        <w:numPr>
+          <w:ilvl w:val="0"/>
+          <w:numId w:val="1"/>
+        </w:numPr>
+        <w:spacing w:after="60"/>
+      </w:pPr>
+      <w:r>
+        <w:t xml:space="preserve">PRINT_AGENT_PORT</w:t>
+      </w:r>
+    </w:p>
+    <w:p>
+      <w:pPr>
+        <w:pStyle w:val="ListParagraph"/>
+        <w:numPr>
+          <w:ilvl w:val="0"/>
+          <w:numId w:val="1"/>
+        </w:numPr>
+        <w:spacing w:after="60"/>
+      </w:pPr>
+      <w:r>
+        <w:t xml:space="preserve">PRINT_GATEWAY_BACKEND_URL</w:t>
+      </w:r>
+    </w:p>
+    <w:p>
+      <w:pPr>
+        <w:pStyle w:val="ListParagraph"/>
+        <w:numPr>
+          <w:ilvl w:val="0"/>
+          <w:numId w:val="1"/>
+        </w:numPr>
+        <w:spacing w:after="60"/>
+      </w:pPr>
+      <w:r>
+        <w:t xml:space="preserve">PRINT_GATEWAY_ID</w:t>
+      </w:r>
+    </w:p>
+    <w:p>
+      <w:pPr>
+        <w:pStyle w:val="ListParagraph"/>
+        <w:numPr>
+          <w:ilvl w:val="0"/>
+          <w:numId w:val="1"/>
+        </w:numPr>
+        <w:spacing w:after="60"/>
+      </w:pPr>
+      <w:r>
+        <w:t xml:space="preserve">PRINT_GATEWAY_SECRET</w:t>
+      </w:r>
+    </w:p>
+    <w:p>
+      <w:r>
+        <w:t xml:space="preserve"/>
+      </w:r>
+    </w:p>
+    <w:p>
+      <w:pPr>
+        <w:spacing w:after="80"/>
+      </w:pPr>
+      <w:r>
+        <w:t xml:space="preserve">Use that file when an installed workstation connector must act as a private-LAN site gateway for NETWORK_IPP printers.</w:t>
       </w:r>
     </w:p>
     <w:p>

</xml_diff>

<commit_message>
Add connector downloads and onboarding flow
</commit_message>
<xml_diff>
--- a/DOCUMENTS/backend/local-print-agent/install/README.docx
+++ b/DOCUMENTS/backend/local-print-agent/install/README.docx
@@ -35,6 +35,110 @@
       </w:pPr>
       <w:r>
         <w:t xml:space="preserve">They are maintainer and packaging assets, not end-user instructions. Production rollout should use a signed installer, MDM, or IT packaging flow so operators never run terminal commands themselves.</w:t>
+      </w:r>
+    </w:p>
+    <w:p>
+      <w:r>
+        <w:t xml:space="preserve"/>
+      </w:r>
+    </w:p>
+    <w:p>
+      <w:pPr>
+        <w:spacing w:after="80"/>
+      </w:pPr>
+      <w:r>
+        <w:t xml:space="preserve">The repository now also includes packaged connector release output under:</w:t>
+      </w:r>
+    </w:p>
+    <w:p>
+      <w:r>
+        <w:t xml:space="preserve"/>
+      </w:r>
+    </w:p>
+    <w:p>
+      <w:pPr>
+        <w:spacing w:before="140" w:after="60"/>
+      </w:pPr>
+      <w:r>
+        <w:rPr>
+          <w:i/>
+          <w:iCs/>
+          <w:color w:val="6b7280"/>
+          <w:sz w:val="18"/>
+          <w:szCs w:val="18"/>
+        </w:rPr>
+        <w:t xml:space="preserve">TEXT code</w:t>
+      </w:r>
+    </w:p>
+    <w:p>
+      <w:pPr>
+        <w:spacing w:after="20"/>
+      </w:pPr>
+      <w:r>
+        <w:rPr>
+          <w:rFonts w:ascii="Menlo" w:cs="Menlo" w:eastAsia="Menlo" w:hAnsi="Menlo"/>
+          <w:color w:val="111827"/>
+          <w:sz w:val="20"/>
+          <w:szCs w:val="20"/>
+        </w:rPr>
+        <w:t xml:space="preserve">backend/local-print-agent/releases/</w:t>
+      </w:r>
+    </w:p>
+    <w:p>
+      <w:r>
+        <w:t xml:space="preserve"/>
+      </w:r>
+    </w:p>
+    <w:p>
+      <w:r>
+        <w:t xml:space="preserve"/>
+      </w:r>
+    </w:p>
+    <w:p>
+      <w:pPr>
+        <w:spacing w:after="80"/>
+      </w:pPr>
+      <w:r>
+        <w:t xml:space="preserve">Build the latest packaged connector artifacts from the backend folder with:</w:t>
+      </w:r>
+    </w:p>
+    <w:p>
+      <w:r>
+        <w:t xml:space="preserve"/>
+      </w:r>
+    </w:p>
+    <w:p>
+      <w:pPr>
+        <w:spacing w:before="140" w:after="60"/>
+      </w:pPr>
+      <w:r>
+        <w:rPr>
+          <w:i/>
+          <w:iCs/>
+          <w:color w:val="6b7280"/>
+          <w:sz w:val="18"/>
+          <w:szCs w:val="18"/>
+        </w:rPr>
+        <w:t xml:space="preserve">BASH code</w:t>
+      </w:r>
+    </w:p>
+    <w:p>
+      <w:pPr>
+        <w:spacing w:after="20"/>
+      </w:pPr>
+      <w:r>
+        <w:rPr>
+          <w:rFonts w:ascii="Menlo" w:cs="Menlo" w:eastAsia="Menlo" w:hAnsi="Menlo"/>
+          <w:color w:val="111827"/>
+          <w:sz w:val="20"/>
+          <w:szCs w:val="20"/>
+        </w:rPr>
+        <w:t xml:space="preserve">npm run connector:release</w:t>
+      </w:r>
+    </w:p>
+    <w:p>
+      <w:r>
+        <w:t xml:space="preserve"/>
       </w:r>
     </w:p>
     <w:p>

</xml_diff>